<commit_message>
paper: print the academic positions in the title block
Completes the author table: P.P. Dr.Sc., Professor, Director of the Institute;
V.L. Dr.Sc., Full Professor, Head of Department; Z.R. PhD, Associate Professor.

Note that MDPI's own template has no field for academic rank and their
production stage drops it, so this line is for the arXiv version and for the
review PDF; it is not expected to survive into a published MDPI article.

41 pp both builds, 0 errors, 0 undefined refs.

Co-Authored-By: Claude Opus 5 <noreply@anthropic.com>
</commit_message>
<xml_diff>
--- a/paper/blackwell-paper-MAKE.docx
+++ b/paper/blackwell-paper-MAKE.docx
@@ -160,6 +160,18 @@
       </w:r>
       <w:r>
         <w:t xml:space="preserve">S. Bandery St. 12, 79013 Lviv, Ukraine</w:t>
+      </w:r>
+      <w:r>
+        <w:br/>
+      </w:r>
+      <w:r>
+        <w:t xml:space="preserve">P.P.: Dr.Sc., Professor, Director of the Institute; V.L.: Dr.Sc., Full Professor, Head of Department;</w:t>
+      </w:r>
+      <w:r>
+        <w:br/>
+      </w:r>
+      <w:r>
+        <w:t xml:space="preserve">Z.R.: PhD, Associate Professor</w:t>
       </w:r>
       <w:r>
         <w:br/>

</xml_diff>

<commit_message>
paper: verify the Alpila Zenodo records, regenerate the MAKE deliverables
All three cited Zenodo DOIs resolve to Pia Alpila records dated 25 June 2026.
Two entries needed correcting: the artifact's title was a paraphrase rather
than the record's own ("LM Recall: Code and Data for 'Context Selection as
Approximate Sufficiency'"), and the preprint's note named two companion
essays that exist but are NOT the ones this paper cites, which reads as a
DOI mismatch. The note now carries only the date; the cited companions are
their own entries. A \citet inside a bibliography note is replaced with
plain text so the numbered MDPI style has no citation inside the reference
list.

README: the scope note still said one cell could not be re-measured. It was.

Regenerated blackwell-paper-make.{tex,pdf} and blackwell-paper-MAKE.docx,
stale since the Lean removal. MAKE variant: 44 pages, 0 errors, 70 numbered
references.

Co-Authored-By: Claude Opus 5 <noreply@anthropic.com>
</commit_message>
<xml_diff>
--- a/paper/blackwell-paper-MAKE.docx
+++ b/paper/blackwell-paper-MAKE.docx
@@ -291,13 +291,13 @@
         <w:pStyle w:val="Abstract"/>
       </w:pPr>
       <w:r>
-        <w:t xml:space="preserve">Choosing what to put in a language model’s prompt is usually done by scoring each candidate source</w:t>
-      </w:r>
-      <w:r>
-        <w:t xml:space="preserve"> </w:t>
-      </w:r>
-      <w:r>
-        <w:t xml:space="preserve">with one number and keeping the top few. We argue this is the wrong abstraction. Two sources can be</w:t>
+        <w:t xml:space="preserve">What goes into a language model’s prompt is usually chosen by scoring each source with one number</w:t>
+      </w:r>
+      <w:r>
+        <w:t xml:space="preserve"> </w:t>
+      </w:r>
+      <w:r>
+        <w:t xml:space="preserve">and keeping the top few. We argue this is the wrong abstraction. Two sources can be</w:t>
       </w:r>
       <w:r>
         <w:t xml:space="preserve"> </w:t>
@@ -379,13 +379,19 @@
         <w:t xml:space="preserve"> </w:t>
       </w:r>
       <w:r>
-        <w:t xml:space="preserve">listwise LLM reranker that reads the deciding detail gets it right, as the theory predicts. Adding</w:t>
-      </w:r>
-      <w:r>
-        <w:t xml:space="preserve"> </w:t>
-      </w:r>
-      <w:r>
-        <w:t xml:space="preserve">a larger source can also hurt: pass rates fall from</w:t>
+        <w:t xml:space="preserve">listwise LLM reranker that reads the deciding detail gets it right. Adding</w:t>
+      </w:r>
+      <w:r>
+        <w:t xml:space="preserve"> </w:t>
+      </w:r>
+      <w:r>
+        <w:t xml:space="preserve">a larger source can also hurt: a strict superset verifiably lowers pass rates on eleven of twelve</w:t>
+      </w:r>
+      <w:r>
+        <w:t xml:space="preserve"> </w:t>
+      </w:r>
+      <w:r>
+        <w:t xml:space="preserve">cells, falling as far as</w:t>
       </w:r>
       <w:r>
         <w:t xml:space="preserve"> </w:t>
@@ -422,16 +428,7 @@
         </m:r>
       </m:oMath>
       <w:r>
-        <w:t xml:space="preserve"> </w:t>
-      </w:r>
-      <w:r>
-        <w:t xml:space="preserve">on eleven of twelve cells,</w:t>
-      </w:r>
-      <w:r>
-        <w:t xml:space="preserve"> </w:t>
-      </w:r>
-      <w:r>
-        <w:t xml:space="preserve">with controls ruling out length and position. The lesson is practical: treat context</w:t>
+        <w:t xml:space="preserve">, with controls ruling out length and position. The lesson is practical: treat context</w:t>
       </w:r>
       <w:r>
         <w:t xml:space="preserve"> </w:t>
@@ -1802,7 +1799,7 @@
           <m:t>+</m:t>
         </m:r>
         <m:r>
-          <m:t>0.35</m:t>
+          <m:t>0.34</m:t>
         </m:r>
       </m:oMath>
       <w:r>
@@ -2269,7 +2266,7 @@
           <m:t>−</m:t>
         </m:r>
         <m:r>
-          <m:t>0.86</m:t>
+          <m:t>0.85</m:t>
         </m:r>
       </m:oMath>
       <w:r>
@@ -34570,7 +34567,7 @@
           <m:t>−</m:t>
         </m:r>
         <m:r>
-          <m:t>0.39</m:t>
+          <m:t>0.38</m:t>
         </m:r>
       </m:oMath>
       <w:r>
@@ -34590,7 +34587,7 @@
           <m:t>−</m:t>
         </m:r>
         <m:r>
-          <m:t>0.86</m:t>
+          <m:t>0.85</m:t>
         </m:r>
       </m:oMath>
       <w:r>
@@ -35262,7 +35259,19 @@
         <w:t xml:space="preserve"> </w:t>
       </w:r>
       <w:r>
-        <w:t xml:space="preserve">spectrum. All figures are real measured runs; no modeled numbers.</w:t>
+        <w:t xml:space="preserve">spectrum. All figures are real measured runs; no modeled numbers. Confidence bounds are</w:t>
+      </w:r>
+      <w:r>
+        <w:t xml:space="preserve"> </w:t>
+      </w:r>
+      <w:r>
+        <w:t xml:space="preserve">rounded outward (a lower bound down, an upper bound toward zero), so every printed bound is</w:t>
+      </w:r>
+      <w:r>
+        <w:t xml:space="preserve"> </w:t>
+      </w:r>
+      <w:r>
+        <w:t xml:space="preserve">implied by the computed one.</w:t>
       </w:r>
     </w:p>
     <w:tbl>
@@ -35270,7 +35279,7 @@
         <w:tblStyle w:val="Table"/>
         <w:tblW w:type="auto" w:w="0"/>
         <w:tblLook w:firstRow="1" w:lastRow="0" w:firstColumn="0" w:lastColumn="0" w:noHBand="0" w:noVBand="0" w:val="0020"/>
-        <w:tblCaption w:val="Consolidated 6-model / 4-vendor verdict. All six models are run the same way, a single API call per attempt at n=40 per cell (§7.3). “Anti-mono. verified” counts, of the two API cells tested per model, those on which the harm contrast’s upper bound clears -\tau = -0.30 at \eta=0.10. “Argorder none” is the no-context baseline PASS on api_argorder, the model-relative-value spectrum. All figures are real measured runs; no modeled numbers."/>
+        <w:tblCaption w:val="Consolidated 6-model / 4-vendor verdict. All six models are run the same way, a single API call per attempt at n=40 per cell (§7.3). “Anti-mono. verified” counts, of the two API cells tested per model, those on which the harm contrast’s upper bound clears -\tau = -0.30 at \eta=0.10. “Argorder none” is the no-context baseline PASS on api_argorder, the model-relative-value spectrum. All figures are real measured runs; no modeled numbers. Confidence bounds are rounded outward (a lower bound down, an upper bound toward zero), so every printed bound is implied by the computed one."/>
       </w:tblPr>
       <w:tblGrid>
         <w:gridCol w:w="1131"/>
@@ -35743,7 +35752,7 @@
                 <m:t>+</m:t>
               </m:r>
               <m:r>
-                <m:t>0.72</m:t>
+                <m:t>0.71</m:t>
               </m:r>
             </m:oMath>
             <w:r>
@@ -35766,7 +35775,7 @@
                 <m:t>+</m:t>
               </m:r>
               <m:r>
-                <m:t>0.72</m:t>
+                <m:t>0.71</m:t>
               </m:r>
             </m:oMath>
             <w:r>
@@ -35812,7 +35821,7 @@
                 <m:t>+</m:t>
               </m:r>
               <m:r>
-                <m:t>0.35</m:t>
+                <m:t>0.34</m:t>
               </m:r>
             </m:oMath>
             <w:r>
@@ -35835,7 +35844,7 @@
                 <m:t>+</m:t>
               </m:r>
               <m:r>
-                <m:t>0.68</m:t>
+                <m:t>0.67</m:t>
               </m:r>
             </m:oMath>
             <w:r>
@@ -36024,7 +36033,7 @@
                 <m:t>+</m:t>
               </m:r>
               <m:r>
-                <m:t>0.72</m:t>
+                <m:t>0.71</m:t>
               </m:r>
             </m:oMath>
             <w:r>
@@ -37336,7 +37345,7 @@
       </w:r>
       <m:oMath>
         <m:r>
-          <m:t>0.08</m:t>
+          <m:t>0.077</m:t>
         </m:r>
       </m:oMath>
       <w:r>
@@ -37350,7 +37359,7 @@
       </w:r>
       <m:oMath>
         <m:r>
-          <m:t>0.09</m:t>
+          <m:t>0.084</m:t>
         </m:r>
       </m:oMath>
       <w:r>
@@ -41813,7 +41822,7 @@
                 <m:t>−</m:t>
               </m:r>
               <m:r>
-                <m:t>0.78</m:t>
+                <m:t>0.77</m:t>
               </m:r>
             </m:oMath>
             <w:r>
@@ -42079,7 +42088,7 @@
                 <m:t>−</m:t>
               </m:r>
               <m:r>
-                <m:t>0.27</m:t>
+                <m:t>0.26</m:t>
               </m:r>
             </m:oMath>
             <w:r>
@@ -42221,7 +42230,7 @@
                 <m:t>−</m:t>
               </m:r>
               <m:r>
-                <m:t>0.82</m:t>
+                <m:t>0.81</m:t>
               </m:r>
             </m:oMath>
             <w:r>
@@ -42342,7 +42351,7 @@
                 <m:t>−</m:t>
               </m:r>
               <m:r>
-                <m:t>0.86</m:t>
+                <m:t>0.85</m:t>
               </m:r>
             </m:oMath>
             <w:r>
@@ -42463,7 +42472,7 @@
                 <m:t>−</m:t>
               </m:r>
               <m:r>
-                <m:t>0.86</m:t>
+                <m:t>0.85</m:t>
               </m:r>
             </m:oMath>
             <w:r>
@@ -42584,7 +42593,7 @@
                 <m:t>−</m:t>
               </m:r>
               <m:r>
-                <m:t>0.86</m:t>
+                <m:t>0.85</m:t>
               </m:r>
             </m:oMath>
             <w:r>
@@ -42826,7 +42835,7 @@
                 <m:t>−</m:t>
               </m:r>
               <m:r>
-                <m:t>0.39</m:t>
+                <m:t>0.38</m:t>
               </m:r>
             </m:oMath>
             <w:r>
@@ -42947,7 +42956,7 @@
                 <m:t>−</m:t>
               </m:r>
               <m:r>
-                <m:t>0.86</m:t>
+                <m:t>0.85</m:t>
               </m:r>
             </m:oMath>
             <w:r>
@@ -43068,7 +43077,7 @@
                 <m:t>−</m:t>
               </m:r>
               <m:r>
-                <m:t>0.86</m:t>
+                <m:t>0.85</m:t>
               </m:r>
             </m:oMath>
             <w:r>
@@ -47397,19 +47406,13 @@
         <w:t xml:space="preserve"> </w:t>
       </w:r>
       <w:r>
-        <w:t xml:space="preserve">declining the task as a suspected prompt injection. GPT-5.5 could not be reached in the published</w:t>
-      </w:r>
-      <w:r>
-        <w:t xml:space="preserve"> </w:t>
-      </w:r>
-      <w:r>
-        <w:t xml:space="preserve">single-shot regime (no such deployment on the available resource) and was re-measured through an</w:t>
-      </w:r>
-      <w:r>
-        <w:t xml:space="preserve"> </w:t>
-      </w:r>
-      <w:r>
-        <w:t xml:space="preserve">agentic CLI, so its row tests the mechanism, not the published proportion.</w:t>
+        <w:t xml:space="preserve">declining the task as a suspected prompt injection. Every row is a single-shot re-measurement in</w:t>
+      </w:r>
+      <w:r>
+        <w:t xml:space="preserve"> </w:t>
+      </w:r>
+      <w:r>
+        <w:t xml:space="preserve">the published regime.</w:t>
       </w:r>
     </w:p>
     <w:tbl>
@@ -47417,7 +47420,7 @@
         <w:tblStyle w:val="Table"/>
         <w:tblW w:type="auto" w:w="0"/>
         <w:tblLook w:firstRow="1" w:lastRow="0" w:firstColumn="0" w:lastColumn="0" w:noHBand="0" w:noVBand="0" w:val="0020"/>
-        <w:tblCaption w:val="Re-measurement with raw-completion retention, n=40 per arm, fresh draws. \Delta is under the published verifier and \Delta_{\mathrm{neu}} under the import-neutralized one. “Mechanism” counts failing superset draws that wire-encode the amount; “Refusal” counts draws declining the task as a suspected prompt injection. GPT-5.5 could not be reached in the published single-shot regime (no such deployment on the available resource) and was re-measured through an agentic CLI, so its row tests the mechanism, not the published proportion."/>
+        <w:tblCaption w:val="Re-measurement with raw-completion retention, n=40 per arm, fresh draws. \Delta is under the published verifier and \Delta_{\mathrm{neu}} under the import-neutralized one. “Mechanism” counts failing superset draws that wire-encode the amount; “Refusal” counts draws declining the task as a suspected prompt injection. Every row is a single-shot re-measurement in the published regime."/>
       </w:tblPr>
       <w:tblGrid>
         <w:gridCol w:w="1131"/>
@@ -49010,23 +49013,6 @@
             <w:r>
               <w:t xml:space="preserve">GPT-5.5</w:t>
             </w:r>
-            <m:oMath>
-              <m:sSup>
-                <m:e>
-                  <m:r>
-                    <m:t>​</m:t>
-                  </m:r>
-                </m:e>
-                <m:sup>
-                  <m:r>
-                    <m:rPr>
-                      <m:sty m:val="p"/>
-                    </m:rPr>
-                    <m:t>†</m:t>
-                  </m:r>
-                </m:sup>
-              </m:sSup>
-            </m:oMath>
           </w:p>
         </w:tc>
         <w:tc>
@@ -49183,23 +49169,6 @@
             <w:r>
               <w:t xml:space="preserve">GPT-5.5</w:t>
             </w:r>
-            <m:oMath>
-              <m:sSup>
-                <m:e>
-                  <m:r>
-                    <m:t>​</m:t>
-                  </m:r>
-                </m:e>
-                <m:sup>
-                  <m:r>
-                    <m:rPr>
-                      <m:sty m:val="p"/>
-                    </m:rPr>
-                    <m:t>†</m:t>
-                  </m:r>
-                </m:sup>
-              </m:sSup>
-            </m:oMath>
           </w:p>
         </w:tc>
         <w:tc>
@@ -49700,7 +49669,24 @@
         <w:t xml:space="preserve"> </w:t>
       </w:r>
       <w:r>
-        <w:t xml:space="preserve">computed from the measured per-cell rates of Table 8. The front-and-routing column</w:t>
+        <w:t xml:space="preserve">computed from the per-cell PASS counts behind Table 8 (averaging the rounded</w:t>
+      </w:r>
+      <w:r>
+        <w:t xml:space="preserve"> </w:t>
+      </w:r>
+      <w:r>
+        <w:t xml:space="preserve">percentages instead would shift a column by up to</w:t>
+      </w:r>
+      <w:r>
+        <w:t xml:space="preserve"> </w:t>
+      </w:r>
+      <m:oMath>
+        <m:r>
+          <m:t>0.4</m:t>
+        </m:r>
+      </m:oMath>
+      <w:r>
+        <w:t xml:space="preserve">). The front-and-routing column</w:t>
       </w:r>
       <w:r>
         <w:t xml:space="preserve"> </w:t>
@@ -49802,7 +49788,7 @@
         <w:tblStyle w:val="Table"/>
         <w:tblW w:type="auto" w:w="0"/>
         <w:tblLook w:firstRow="1" w:lastRow="0" w:firstColumn="0" w:lastColumn="0" w:noHBand="0" w:noVBand="0" w:val="0020"/>
-        <w:tblCaption w:val="Mean PASS (%) over the four verified cells under four selection policies, per model, computed from the measured per-cell rates of Table 8. The front-and-routing column is the per-cell maximum of W_1 and W_2 and is therefore the ceiling of any selection policy on these cells; its remaining gap to 100\% is model capability, not selection error."/>
+        <w:tblCaption w:val="Mean PASS (%) over the four verified cells under four selection policies, per model, computed from the per-cell PASS counts behind Table 8 (averaging the rounded percentages instead would shift a column by up to 0.4). The front-and-routing column is the per-cell maximum of W_1 and W_2 and is therefore the ceiling of any selection policy on these cells; its remaining gap to 100\% is model capability, not selection error."/>
       </w:tblPr>
       <w:tblGrid>
         <w:gridCol w:w="1584"/>
@@ -49937,7 +49923,7 @@
               <w:jc w:val="center"/>
             </w:pPr>
             <w:r>
-              <w:t xml:space="preserve">60.5</w:t>
+              <w:t xml:space="preserve">60.6</w:t>
             </w:r>
           </w:p>
         </w:tc>
@@ -49949,7 +49935,7 @@
               <w:jc w:val="center"/>
             </w:pPr>
             <w:r>
-              <w:t xml:space="preserve">63.0</w:t>
+              <w:t xml:space="preserve">63.1</w:t>
             </w:r>
           </w:p>
         </w:tc>
@@ -49961,7 +49947,7 @@
               <w:jc w:val="center"/>
             </w:pPr>
             <w:r>
-              <w:t xml:space="preserve">53.0</w:t>
+              <w:t xml:space="preserve">53.1</w:t>
             </w:r>
           </w:p>
         </w:tc>
@@ -49977,7 +49963,7 @@
                 <w:b/>
                 <w:bCs/>
               </w:rPr>
-              <w:t xml:space="preserve">85.5</w:t>
+              <w:t xml:space="preserve">85.6</w:t>
             </w:r>
           </w:p>
         </w:tc>
@@ -50015,7 +50001,7 @@
               <w:jc w:val="center"/>
             </w:pPr>
             <w:r>
-              <w:t xml:space="preserve">74.5</w:t>
+              <w:t xml:space="preserve">74.4</w:t>
             </w:r>
           </w:p>
         </w:tc>
@@ -50027,7 +50013,7 @@
               <w:jc w:val="center"/>
             </w:pPr>
             <w:r>
-              <w:t xml:space="preserve">36.8</w:t>
+              <w:t xml:space="preserve">36.9</w:t>
             </w:r>
           </w:p>
         </w:tc>
@@ -50043,7 +50029,7 @@
                 <w:b/>
                 <w:bCs/>
               </w:rPr>
-              <w:t xml:space="preserve">99.5</w:t>
+              <w:t xml:space="preserve">99.4</w:t>
             </w:r>
           </w:p>
         </w:tc>
@@ -50081,7 +50067,7 @@
               <w:jc w:val="center"/>
             </w:pPr>
             <w:r>
-              <w:t xml:space="preserve">74.5</w:t>
+              <w:t xml:space="preserve">74.4</w:t>
             </w:r>
           </w:p>
         </w:tc>
@@ -50093,7 +50079,7 @@
               <w:jc w:val="center"/>
             </w:pPr>
             <w:r>
-              <w:t xml:space="preserve">59.5</w:t>
+              <w:t xml:space="preserve">59.4</w:t>
             </w:r>
           </w:p>
         </w:tc>
@@ -50109,7 +50095,7 @@
                 <w:b/>
                 <w:bCs/>
               </w:rPr>
-              <w:t xml:space="preserve">99.5</w:t>
+              <w:t xml:space="preserve">99.4</w:t>
             </w:r>
           </w:p>
         </w:tc>
@@ -50201,7 +50187,7 @@
               <w:jc w:val="center"/>
             </w:pPr>
             <w:r>
-              <w:t xml:space="preserve">60.3</w:t>
+              <w:t xml:space="preserve">60.0</w:t>
             </w:r>
           </w:p>
         </w:tc>
@@ -50213,7 +50199,7 @@
               <w:jc w:val="center"/>
             </w:pPr>
             <w:r>
-              <w:t xml:space="preserve">52.8</w:t>
+              <w:t xml:space="preserve">52.5</w:t>
             </w:r>
           </w:p>
         </w:tc>
@@ -50225,7 +50211,7 @@
               <w:jc w:val="center"/>
             </w:pPr>
             <w:r>
-              <w:t xml:space="preserve">42.0</w:t>
+              <w:t xml:space="preserve">41.9</w:t>
             </w:r>
           </w:p>
         </w:tc>
@@ -50241,7 +50227,7 @@
                 <w:b/>
                 <w:bCs/>
               </w:rPr>
-              <w:t xml:space="preserve">77.3</w:t>
+              <w:t xml:space="preserve">76.9</w:t>
             </w:r>
           </w:p>
         </w:tc>
@@ -50291,7 +50277,7 @@
               <w:jc w:val="center"/>
             </w:pPr>
             <w:r>
-              <w:t xml:space="preserve">48.0</w:t>
+              <w:t xml:space="preserve">48.1</w:t>
             </w:r>
           </w:p>
         </w:tc>
@@ -50373,7 +50359,7 @@
                 <w:b/>
                 <w:bCs/>
               </w:rPr>
-              <w:t xml:space="preserve">93.4</w:t>
+              <w:t xml:space="preserve">93.3</w:t>
             </w:r>
           </w:p>
         </w:tc>
@@ -51570,7 +51556,7 @@
           <m:t>−</m:t>
         </m:r>
         <m:r>
-          <m:t>0.86</m:t>
+          <m:t>0.85</m:t>
         </m:r>
       </m:oMath>
       <w:r>
@@ -64478,7 +64464,7 @@
           <m:t>−</m:t>
         </m:r>
         <m:r>
-          <m:t>0.21</m:t>
+          <m:t>0.25</m:t>
         </m:r>
       </m:oMath>
       <w:r>
@@ -65860,7 +65846,7 @@
         <w:t xml:space="preserve"> </w:t>
       </w:r>
       <w:r>
-        <w:t xml:space="preserve">intervals), while the residual gap below</w:t>
+        <w:t xml:space="preserve">intervals), while on the carrying cell the instructed superset still sits below</w:t>
       </w:r>
       <w:r>
         <w:t xml:space="preserve"> </w:t>
@@ -65883,7 +65869,7 @@
         <w:t xml:space="preserve"> </w:t>
       </w:r>
       <w:r>
-        <w:t xml:space="preserve">alone on the carrying cell (</w:t>
+        <w:t xml:space="preserve">alone (</w:t>
       </w:r>
       <m:oMath>
         <m:r>
@@ -65914,88 +65900,97 @@
         </m:r>
       </m:oMath>
       <w:r>
-        <w:t xml:space="preserve">, intervals</w:t>
-      </w:r>
-      <w:r>
-        <w:t xml:space="preserve"> </w:t>
-      </w:r>
-      <m:oMath>
-        <m:r>
-          <m:rPr>
-            <m:sty m:val="p"/>
-          </m:rPr>
-          <m:t>[</m:t>
-        </m:r>
-        <m:r>
-          <m:t>0.62</m:t>
-        </m:r>
-        <m:r>
-          <m:rPr>
-            <m:sty m:val="p"/>
-          </m:rPr>
-          <m:t>,</m:t>
-        </m:r>
-        <m:r>
-          <m:t>0.92</m:t>
-        </m:r>
-        <m:r>
-          <m:rPr>
-            <m:sty m:val="p"/>
-          </m:rPr>
-          <m:t>]</m:t>
-        </m:r>
-      </m:oMath>
-      <w:r>
-        <w:t xml:space="preserve"> </w:t>
-      </w:r>
-      <w:r>
-        <w:t xml:space="preserve">vs. </w:t>
-      </w:r>
-      <m:oMath>
-        <m:r>
-          <m:rPr>
-            <m:sty m:val="p"/>
-          </m:rPr>
-          <m:t>[</m:t>
-        </m:r>
-        <m:r>
-          <m:t>0.90</m:t>
-        </m:r>
-        <m:r>
-          <m:rPr>
-            <m:sty m:val="p"/>
-          </m:rPr>
-          <m:t>,</m:t>
-        </m:r>
-        <m:r>
-          <m:t>1.00</m:t>
-        </m:r>
-        <m:r>
-          <m:rPr>
-            <m:sty m:val="p"/>
-          </m:rPr>
-          <m:t>]</m:t>
-        </m:r>
-      </m:oMath>
-      <w:r>
-        <w:t xml:space="preserve">) is directional but not separated at</w:t>
-      </w:r>
-      <w:r>
-        <w:t xml:space="preserve"> </w:t>
-      </w:r>
-      <w:r>
-        <w:t xml:space="preserve">this</w:t>
-      </w:r>
-      <w:r>
-        <w:t xml:space="preserve"> </w:t>
-      </w:r>
-      <m:oMath>
-        <m:r>
-          <m:t>n</m:t>
-        </m:r>
-      </m:oMath>
-      <w:r>
-        <w:t xml:space="preserve">. We pre-commit to the two readings jointly. First, the harm is substantially mediated by</w:t>
+        <w:t xml:space="preserve">). That residual gap is verified negative by the same two-arm contrast</w:t>
+      </w:r>
+      <w:r>
+        <w:t xml:space="preserve"> </w:t>
+      </w:r>
+      <w:r>
+        <w:t xml:space="preserve">used throughout,</w:t>
+      </w:r>
+      <w:r>
+        <w:t xml:space="preserve"> </w:t>
+      </w:r>
+      <m:oMath>
+        <m:sSub>
+          <m:e>
+            <m:r>
+              <m:rPr>
+                <m:sty m:val="p"/>
+              </m:rPr>
+              <m:t>Δ</m:t>
+            </m:r>
+          </m:e>
+          <m:sub>
+            <m:r>
+              <m:t>T</m:t>
+            </m:r>
+          </m:sub>
+        </m:sSub>
+        <m:r>
+          <m:rPr>
+            <m:sty m:val="p"/>
+          </m:rPr>
+          <m:t>=</m:t>
+        </m:r>
+        <m:r>
+          <m:rPr>
+            <m:sty m:val="p"/>
+          </m:rPr>
+          <m:t>−</m:t>
+        </m:r>
+        <m:r>
+          <m:t>0.20</m:t>
+        </m:r>
+      </m:oMath>
+      <w:r>
+        <w:t xml:space="preserve"> </w:t>
+      </w:r>
+      <w:r>
+        <w:t xml:space="preserve">with upper bound</w:t>
+      </w:r>
+      <w:r>
+        <w:t xml:space="preserve"> </w:t>
+      </w:r>
+      <m:oMath>
+        <m:r>
+          <m:rPr>
+            <m:sty m:val="p"/>
+          </m:rPr>
+          <m:t>−</m:t>
+        </m:r>
+        <m:r>
+          <m:t>0.03</m:t>
+        </m:r>
+      </m:oMath>
+      <w:r>
+        <w:t xml:space="preserve">, but it falls far short of the harm</w:t>
+      </w:r>
+      <w:r>
+        <w:t xml:space="preserve"> </w:t>
+      </w:r>
+      <w:r>
+        <w:t xml:space="preserve">margin</w:t>
+      </w:r>
+      <w:r>
+        <w:t xml:space="preserve"> </w:t>
+      </w:r>
+      <m:oMath>
+        <m:r>
+          <m:t>τ</m:t>
+        </m:r>
+        <m:r>
+          <m:rPr>
+            <m:sty m:val="p"/>
+          </m:rPr>
+          <m:t>=</m:t>
+        </m:r>
+        <m:r>
+          <m:t>0.30</m:t>
+        </m:r>
+      </m:oMath>
+      <w:r>
+        <w:t xml:space="preserve">: the instruction removes the collapse without closing the gap. We pre-commit to the two readings jointly. First, the harm is substantially mediated by</w:t>
       </w:r>
       <w:r>
         <w:t xml:space="preserve"> </w:t>
@@ -67602,7 +67597,7 @@
         <w:t xml:space="preserve"> </w:t>
       </w:r>
       <w:r>
-        <w:t xml:space="preserve">cell, whose first run predated the retry wrapper. One cell could not be re-measured at revision time: GPT-5.5</w:t>
+        <w:t xml:space="preserve">cell, whose first run predated the retry wrapper. One cell resisted re-measurement for longer than the others: GPT-5.5</w:t>
       </w:r>
       <w:r>
         <w:t xml:space="preserve"> </w:t>
@@ -67634,7 +67629,7 @@
         <w:t xml:space="preserve"> </w:t>
       </w:r>
       <w:r>
-        <w:t xml:space="preserve">returned HTTP 500 after retries on an unknown number of draws and the Azure quota was unavailable, so its reported</w:t>
+        <w:t xml:space="preserve">returned HTTP 500 after retries during the original run and no GPT-5.5 deployment was available on the resource at first revision, so for one revision cycle its reported</w:t>
       </w:r>
       <w:r>
         <w:t xml:space="preserve"> </w:t>
@@ -67657,7 +67652,93 @@
         <w:t xml:space="preserve"> </w:t>
       </w:r>
       <w:r>
-        <w:t xml:space="preserve">still contains outage-scored draws. It is an expected-zero cell (the arm lacks the decisive fact, and it is</w:t>
+        <w:t xml:space="preserve">was carried with outage-scored draws in it. A GPT-5.5 deployment was subsequently provisioned and all four GPT-5.5 cells were re-run single-shot at</w:t>
+      </w:r>
+      <w:r>
+        <w:t xml:space="preserve"> </w:t>
+      </w:r>
+      <m:oMath>
+        <m:r>
+          <m:t>n</m:t>
+        </m:r>
+        <m:r>
+          <m:rPr>
+            <m:sty m:val="p"/>
+          </m:rPr>
+          <m:t>=</m:t>
+        </m:r>
+        <m:r>
+          <m:t>40</m:t>
+        </m:r>
+      </m:oMath>
+      <w:r>
+        <w:t xml:space="preserve"> </w:t>
+      </w:r>
+      <w:r>
+        <w:t xml:space="preserve">per arm with retention and zero transport failures. The re-run reproduces the published grid exactly in all eight</w:t>
+      </w:r>
+      <w:r>
+        <w:t xml:space="preserve"> </w:t>
+      </w:r>
+      <m:oMath>
+        <m:sSub>
+          <m:e>
+            <m:r>
+              <m:t>W</m:t>
+            </m:r>
+          </m:e>
+          <m:sub>
+            <m:r>
+              <m:t>1</m:t>
+            </m:r>
+          </m:sub>
+        </m:sSub>
+      </m:oMath>
+      <w:r>
+        <w:t xml:space="preserve">/</w:t>
+      </w:r>
+      <m:oMath>
+        <m:sSub>
+          <m:e>
+            <m:r>
+              <m:t>W</m:t>
+            </m:r>
+          </m:e>
+          <m:sub>
+            <m:r>
+              <m:t>2</m:t>
+            </m:r>
+          </m:sub>
+        </m:sSub>
+      </m:oMath>
+      <w:r>
+        <w:t xml:space="preserve"> </w:t>
+      </w:r>
+      <w:r>
+        <w:t xml:space="preserve">entries, the disputed cell included (</w:t>
+      </w:r>
+      <m:oMath>
+        <m:sSub>
+          <m:e>
+            <m:r>
+              <m:t>W</m:t>
+            </m:r>
+          </m:e>
+          <m:sub>
+            <m:r>
+              <m:t>2</m:t>
+            </m:r>
+          </m:sub>
+        </m:sSub>
+      </m:oMath>
+      <w:r>
+        <w:t xml:space="preserve">/</w:t>
+      </w:r>
+      <w:r>
+        <w:rPr>
+          <w:rStyle w:val="VerbatimChar"/>
+        </w:rPr>
+        <w:t xml:space="preserve">trap_store_wire</w:t>
       </w:r>
       <w:r>
         <w:t xml:space="preserve"> </w:t>
@@ -67670,20 +67751,17 @@
           <m:rPr>
             <m:sty m:val="p"/>
           </m:rPr>
-          <m:t>%</m:t>
-        </m:r>
-      </m:oMath>
-      <w:r>
-        <w:t xml:space="preserve"> </w:t>
-      </w:r>
-      <w:r>
-        <w:t xml:space="preserve">on all five other</w:t>
-      </w:r>
-      <w:r>
-        <w:t xml:space="preserve"> </w:t>
-      </w:r>
-      <w:r>
-        <w:t xml:space="preserve">models) and lies on no binding bound, but for that one cell the reported</w:t>
+          <m:t>/</m:t>
+        </m:r>
+        <m:r>
+          <m:t>40</m:t>
+        </m:r>
+      </m:oMath>
+      <w:r>
+        <w:t xml:space="preserve"> </w:t>
+      </w:r>
+      <w:r>
+        <w:t xml:space="preserve">clean), so every cell in the coverage family is now a valid binomial sample and the reported</w:t>
       </w:r>
       <w:r>
         <w:t xml:space="preserve"> </w:t>
@@ -67697,124 +67775,7 @@
         <w:t xml:space="preserve"> </w:t>
       </w:r>
       <w:r>
-        <w:t xml:space="preserve">is an upper bound on</w:t>
-      </w:r>
-      <w:r>
-        <w:t xml:space="preserve"> </w:t>
-      </w:r>
-      <w:r>
-        <w:t xml:space="preserve">the number of real draws. Because a coverage family should contain only cells that are valid</w:t>
-      </w:r>
-      <w:r>
-        <w:t xml:space="preserve"> </w:t>
-      </w:r>
-      <w:r>
-        <w:t xml:space="preserve">binomial samples, we also report GPT-5.5’s certificate over the admissible three-cell set that</w:t>
-      </w:r>
-      <w:r>
-        <w:t xml:space="preserve"> </w:t>
-      </w:r>
-      <w:r>
-        <w:t xml:space="preserve">omits the trap: both directions then read</w:t>
-      </w:r>
-      <w:r>
-        <w:t xml:space="preserve"> </w:t>
-      </w:r>
-      <m:oMath>
-        <m:r>
-          <m:rPr>
-            <m:sty m:val="p"/>
-          </m:rPr>
-          <m:t>+</m:t>
-        </m:r>
-        <m:r>
-          <m:t>0.774</m:t>
-        </m:r>
-      </m:oMath>
-      <w:r>
-        <w:t xml:space="preserve">, slightly</w:t>
-      </w:r>
-      <w:r>
-        <w:t xml:space="preserve"> </w:t>
-      </w:r>
-      <w:r>
-        <w:rPr>
-          <w:i/>
-          <w:iCs/>
-        </w:rPr>
-        <w:t xml:space="preserve">stronger</w:t>
-      </w:r>
-      <w:r>
-        <w:t xml:space="preserve"> </w:t>
-      </w:r>
-      <w:r>
-        <w:t xml:space="preserve">than the four-cell</w:t>
-      </w:r>
-      <w:r>
-        <w:t xml:space="preserve"> </w:t>
-      </w:r>
-      <m:oMath>
-        <m:r>
-          <m:rPr>
-            <m:sty m:val="p"/>
-          </m:rPr>
-          <m:t>+</m:t>
-        </m:r>
-        <m:r>
-          <m:t>0.762</m:t>
-        </m:r>
-      </m:oMath>
-      <w:r>
-        <w:t xml:space="preserve">, since dropping a cell widens the per-interval level from</w:t>
-      </w:r>
-      <w:r>
-        <w:t xml:space="preserve"> </w:t>
-      </w:r>
-      <m:oMath>
-        <m:r>
-          <m:t>η</m:t>
-        </m:r>
-        <m:r>
-          <m:rPr>
-            <m:sty m:val="p"/>
-          </m:rPr>
-          <m:t>/</m:t>
-        </m:r>
-        <m:r>
-          <m:t>8</m:t>
-        </m:r>
-      </m:oMath>
-      <w:r>
-        <w:t xml:space="preserve"> </w:t>
-      </w:r>
-      <w:r>
-        <w:t xml:space="preserve">to</w:t>
-      </w:r>
-      <w:r>
-        <w:t xml:space="preserve"> </w:t>
-      </w:r>
-      <m:oMath>
-        <m:r>
-          <m:t>η</m:t>
-        </m:r>
-        <m:r>
-          <m:rPr>
-            <m:sty m:val="p"/>
-          </m:rPr>
-          <m:t>/</m:t>
-        </m:r>
-        <m:r>
-          <m:t>6</m:t>
-        </m:r>
-      </m:oMath>
-      <w:r>
-        <w:t xml:space="preserve">. Excluding</w:t>
-      </w:r>
-      <w:r>
-        <w:t xml:space="preserve"> </w:t>
-      </w:r>
-      <w:r>
-        <w:t xml:space="preserve">the cell therefore repairs the coverage construction without weakening the reported crossing.</w:t>
+        <w:t xml:space="preserve">is the number of real draws throughout. The GPT-5.5 rows of Table 6 come from that run.</w:t>
       </w:r>
     </w:p>
     <w:bookmarkEnd w:id="152"/>
@@ -68436,7 +68397,21 @@
           <w:i/>
           <w:iCs/>
         </w:rPr>
-        <w:t xml:space="preserve">: Corpus, Experiment Code and Per-Decoder Results</w:t>
+        <w:t xml:space="preserve">: Code and Data for</w:t>
+      </w:r>
+      <w:r>
+        <w:rPr>
+          <w:i/>
+          <w:iCs/>
+        </w:rPr>
+        <w:t xml:space="preserve"> </w:t>
+      </w:r>
+      <w:r>
+        <w:rPr>
+          <w:i/>
+          <w:iCs/>
+        </w:rPr>
+        <w:t xml:space="preserve">“Context Selection as Approximate Sufficiency”</w:t>
       </w:r>
       <w:r>
         <w:t xml:space="preserve">. Zenodo.</w:t>

</xml_diff>

<commit_message>
CRediT: restore the co-authors' discussion-stage roles, keep the provenance note
The corresponding author confirms the co-authors contributed to conception,
design and interpretation in discussion rather than in code, so conceptualization
(V.L.), methodology (V.L., P.P.), formal analysis (P.P.), validation (V.L., Z.R.),
resources (V.L.) and visualization (Z.R.) are restored.

The paragraph added in the previous commit stays, reworded so it explains the
asymmetry instead of appearing to contradict the restored roles: contributions
made in discussion leave no trace in a repository by their nature, while the
implementation is fully traceable there, and the commit history is authored
solely by A.B. A reviewer therefore sees why the two records differ rather than
inferring something from the gap.

Claude remains outside CRediT and outside the author list.

47 pages, 0 errors, 72 numbered references.

Co-Authored-By: Claude Opus 5 <noreply@anthropic.com>
</commit_message>
<xml_diff>
--- a/paper/blackwell-paper-MAKE.docx
+++ b/paper/blackwell-paper-MAKE.docx
@@ -58160,31 +58160,31 @@
         <w:pStyle w:val="FirstParagraph"/>
       </w:pPr>
       <w:r>
-        <w:t xml:space="preserve">Conceptualization, A.B.; methodology, A.B.; software, A.B.; validation, A.B.; formal analysis,</w:t>
-      </w:r>
-      <w:r>
-        <w:t xml:space="preserve"> </w:t>
-      </w:r>
-      <w:r>
-        <w:t xml:space="preserve">A.B.; investigation, A.B.; data curation, A.B.; writing—original draft preparation, A.B.;</w:t>
-      </w:r>
-      <w:r>
-        <w:t xml:space="preserve"> </w:t>
-      </w:r>
-      <w:r>
-        <w:t xml:space="preserve">visualization, A.B.; writing—review and editing, A.B., V.L., P.P. and Z.R.; supervision, V.L.</w:t>
-      </w:r>
-      <w:r>
-        <w:t xml:space="preserve"> </w:t>
-      </w:r>
-      <w:r>
-        <w:t xml:space="preserve">and P.P.; project administration, V.L. All authors have read and agreed to the published version</w:t>
-      </w:r>
-      <w:r>
-        <w:t xml:space="preserve"> </w:t>
-      </w:r>
-      <w:r>
-        <w:t xml:space="preserve">of the manuscript.</w:t>
+        <w:t xml:space="preserve">Conceptualization, A.B. and V.L.; methodology, A.B., V.L. and P.P.; software, A.B.; validation,</w:t>
+      </w:r>
+      <w:r>
+        <w:t xml:space="preserve"> </w:t>
+      </w:r>
+      <w:r>
+        <w:t xml:space="preserve">A.B., V.L. and Z.R.; formal analysis, A.B. and P.P.; investigation, A.B.; resources, V.L.; data</w:t>
+      </w:r>
+      <w:r>
+        <w:t xml:space="preserve"> </w:t>
+      </w:r>
+      <w:r>
+        <w:t xml:space="preserve">curation, A.B.; writing—original draft preparation, A.B.; writing—review and editing, A.B.,</w:t>
+      </w:r>
+      <w:r>
+        <w:t xml:space="preserve"> </w:t>
+      </w:r>
+      <w:r>
+        <w:t xml:space="preserve">V.L., P.P. and Z.R.; visualization, A.B. and Z.R.; supervision, V.L. and P.P.; project</w:t>
+      </w:r>
+      <w:r>
+        <w:t xml:space="preserve"> </w:t>
+      </w:r>
+      <w:r>
+        <w:t xml:space="preserve">administration, V.L. All authors have read and agreed to the published version of the manuscript.</w:t>
       </w:r>
     </w:p>
     <w:p>
@@ -58192,25 +58192,43 @@
         <w:pStyle w:val="BodyText"/>
       </w:pPr>
       <w:r>
-        <w:t xml:space="preserve">The division above is evidenced by the artifact repository, whose commit history is authored</w:t>
-      </w:r>
-      <w:r>
-        <w:t xml:space="preserve"> </w:t>
-      </w:r>
-      <w:r>
-        <w:t xml:space="preserve">solely by A.B.: the measurement harness, every run, the raw records and the analysis scripts were</w:t>
-      </w:r>
-      <w:r>
-        <w:t xml:space="preserve"> </w:t>
-      </w:r>
-      <w:r>
-        <w:t xml:space="preserve">produced by the corresponding author. The generative-AI assistance described in the</w:t>
-      </w:r>
-      <w:r>
-        <w:t xml:space="preserve"> </w:t>
-      </w:r>
-      <w:r>
-        <w:t xml:space="preserve">Acknowledgments is a tool and holds no authorship and no CRediT role.</w:t>
+        <w:t xml:space="preserve">To be precise about where each kind of contribution is recorded: the co-authors’ contributions to</w:t>
+      </w:r>
+      <w:r>
+        <w:t xml:space="preserve"> </w:t>
+      </w:r>
+      <w:r>
+        <w:t xml:space="preserve">conceptualization, methodology, formal analysis, validation and revision were made in discussion</w:t>
+      </w:r>
+      <w:r>
+        <w:t xml:space="preserve"> </w:t>
+      </w:r>
+      <w:r>
+        <w:t xml:space="preserve">and review and so leave no trace in the repository, whereas the implementation is fully traceable</w:t>
+      </w:r>
+      <w:r>
+        <w:t xml:space="preserve"> </w:t>
+      </w:r>
+      <w:r>
+        <w:t xml:space="preserve">there. The commit history of the artifact repository is authored solely by A.B., who wrote the</w:t>
+      </w:r>
+      <w:r>
+        <w:t xml:space="preserve"> </w:t>
+      </w:r>
+      <w:r>
+        <w:t xml:space="preserve">measurement harness, executed every run, and produced the raw records and analysis scripts. The</w:t>
+      </w:r>
+      <w:r>
+        <w:t xml:space="preserve"> </w:t>
+      </w:r>
+      <w:r>
+        <w:t xml:space="preserve">generative-AI assistance described in the Acknowledgments is a tool: it holds no authorship and no</w:t>
+      </w:r>
+      <w:r>
+        <w:t xml:space="preserve"> </w:t>
+      </w:r>
+      <w:r>
+        <w:t xml:space="preserve">CRediT role.</w:t>
       </w:r>
     </w:p>
     <w:bookmarkEnd w:id="127"/>

</xml_diff>

<commit_message>
Correspondence to Petro Pukach
The asterisk moves from Bilous to Pukach and the correspondence line now carries
petro.y.pukach@lpnu.ua. Author ORDER is unchanged: Bilous, Lytvyn, Pukach, Rybchak.

MDPI prints each author email under their own affiliation, so Bilous email, which
previously appeared only in the correspondence line, is now listed under
affiliation 1 with Lytvyn and Rybchak, and affiliation 2 no longer repeats
Pukach address.

Checklist and cover letter updated to match; the manuscript body never names a
corresponding author by role, so nothing else changes.

Co-Authored-By: Claude Opus 5 <noreply@anthropic.com>
</commit_message>
<xml_diff>
--- a/paper/blackwell-paper-MAKE.docx
+++ b/paper/blackwell-paper-MAKE.docx
@@ -34,6 +34,52 @@
             <m:r>
               <m:t>1</m:t>
             </m:r>
+          </m:sup>
+        </m:sSup>
+      </m:oMath>
+      <w:r>
+        <w:t xml:space="preserve">,</w:t>
+      </w:r>
+      <w:r>
+        <w:t xml:space="preserve"> </w:t>
+      </w:r>
+      <w:r>
+        <w:t xml:space="preserve">Vasyl Lytvyn </w:t>
+      </w:r>
+      <m:oMath>
+        <m:sSup>
+          <m:e>
+            <m:r>
+              <m:t>​</m:t>
+            </m:r>
+          </m:e>
+          <m:sup>
+            <m:r>
+              <m:t>1</m:t>
+            </m:r>
+          </m:sup>
+        </m:sSup>
+      </m:oMath>
+      <w:r>
+        <w:t xml:space="preserve">,</w:t>
+      </w:r>
+      <w:r>
+        <w:br/>
+      </w:r>
+      <w:r>
+        <w:t xml:space="preserve">Petro Pukach </w:t>
+      </w:r>
+      <m:oMath>
+        <m:sSup>
+          <m:e>
+            <m:r>
+              <m:t>​</m:t>
+            </m:r>
+          </m:e>
+          <m:sup>
+            <m:r>
+              <m:t>2</m:t>
+            </m:r>
             <m:r>
               <m:rPr>
                 <m:sty m:val="p"/>
@@ -56,7 +102,7 @@
         <w:t xml:space="preserve"> </w:t>
       </w:r>
       <w:r>
-        <w:t xml:space="preserve">Vasyl Lytvyn </w:t>
+        <w:t xml:space="preserve">Zoriana Rybchak </w:t>
       </w:r>
       <m:oMath>
         <m:sSup>
@@ -73,14 +119,8 @@
         </m:sSup>
       </m:oMath>
       <w:r>
-        <w:t xml:space="preserve">,</w:t>
-      </w:r>
-      <w:r>
         <w:br/>
       </w:r>
-      <w:r>
-        <w:t xml:space="preserve">Petro Pukach </w:t>
-      </w:r>
       <m:oMath>
         <m:sSup>
           <m:e>
@@ -90,19 +130,73 @@
           </m:e>
           <m:sup>
             <m:r>
-              <m:t>2</m:t>
+              <m:t>1</m:t>
             </m:r>
           </m:sup>
         </m:sSup>
       </m:oMath>
       <w:r>
-        <w:t xml:space="preserve">,</w:t>
-      </w:r>
-      <w:r>
-        <w:t xml:space="preserve"> </w:t>
-      </w:r>
-      <w:r>
-        <w:t xml:space="preserve">Zoriana Rybchak </w:t>
+        <w:t xml:space="preserve"> Department of Information Systems and Networks,</w:t>
+      </w:r>
+      <w:r>
+        <w:br/>
+      </w:r>
+      <w:r>
+        <w:t xml:space="preserve">Institute of Computer Science and Information Technologies,</w:t>
+      </w:r>
+      <w:r>
+        <w:br/>
+      </w:r>
+      <w:r>
+        <w:t xml:space="preserve">Lviv Polytechnic National University, S. Bandery St. 12, 79013 Lviv, Ukraine;</w:t>
+      </w:r>
+      <w:r>
+        <w:br/>
+      </w:r>
+      <w:r>
+        <w:rPr>
+          <w:rStyle w:val="VerbatimChar"/>
+        </w:rPr>
+        <w:t xml:space="preserve">andriy.bilous@uitware.com</w:t>
+      </w:r>
+      <w:r>
+        <w:t xml:space="preserve"> </w:t>
+      </w:r>
+      <w:r>
+        <w:t xml:space="preserve">(A.B.);</w:t>
+      </w:r>
+      <w:r>
+        <w:t xml:space="preserve"> </w:t>
+      </w:r>
+      <w:r>
+        <w:rPr>
+          <w:rStyle w:val="VerbatimChar"/>
+        </w:rPr>
+        <w:t xml:space="preserve">vasyl.v.lytvyn@lpnu.ua</w:t>
+      </w:r>
+      <w:r>
+        <w:t xml:space="preserve"> </w:t>
+      </w:r>
+      <w:r>
+        <w:t xml:space="preserve">(V.L.);</w:t>
+      </w:r>
+      <w:r>
+        <w:br/>
+      </w:r>
+      <w:r>
+        <w:rPr>
+          <w:rStyle w:val="VerbatimChar"/>
+        </w:rPr>
+        <w:t xml:space="preserve">zoriana.l.rybchak@lpnu.ua</w:t>
+      </w:r>
+      <w:r>
+        <w:t xml:space="preserve"> </w:t>
+      </w:r>
+      <w:r>
+        <w:t xml:space="preserve">(Z.R.)</w:t>
+      </w:r>
+      <w:r>
+        <w:br/>
       </w:r>
       <m:oMath>
         <m:sSup>
@@ -113,107 +207,19 @@
           </m:e>
           <m:sup>
             <m:r>
-              <m:t>1</m:t>
+              <m:t>2</m:t>
             </m:r>
           </m:sup>
         </m:sSup>
       </m:oMath>
       <w:r>
+        <w:t xml:space="preserve"> Institute of Applied Mathematics and Fundamental Sciences,</w:t>
+      </w:r>
+      <w:r>
         <w:br/>
       </w:r>
-      <m:oMath>
-        <m:sSup>
-          <m:e>
-            <m:r>
-              <m:t>​</m:t>
-            </m:r>
-          </m:e>
-          <m:sup>
-            <m:r>
-              <m:t>1</m:t>
-            </m:r>
-          </m:sup>
-        </m:sSup>
-      </m:oMath>
-      <w:r>
-        <w:t xml:space="preserve"> Department of Information Systems and Networks,</w:t>
-      </w:r>
-      <w:r>
-        <w:br/>
-      </w:r>
-      <w:r>
-        <w:t xml:space="preserve">Institute of Computer Science and Information Technologies,</w:t>
-      </w:r>
-      <w:r>
-        <w:br/>
-      </w:r>
-      <w:r>
-        <w:t xml:space="preserve">Lviv Polytechnic National University, S. Bandery St. 12, 79013 Lviv, Ukraine;</w:t>
-      </w:r>
-      <w:r>
-        <w:br/>
-      </w:r>
-      <w:r>
-        <w:rPr>
-          <w:rStyle w:val="VerbatimChar"/>
-        </w:rPr>
-        <w:t xml:space="preserve">vasyl.v.lytvyn@lpnu.ua</w:t>
-      </w:r>
-      <w:r>
-        <w:t xml:space="preserve"> </w:t>
-      </w:r>
-      <w:r>
-        <w:t xml:space="preserve">(V.L.);</w:t>
-      </w:r>
-      <w:r>
-        <w:t xml:space="preserve"> </w:t>
-      </w:r>
-      <w:r>
-        <w:rPr>
-          <w:rStyle w:val="VerbatimChar"/>
-        </w:rPr>
-        <w:t xml:space="preserve">zoriana.l.rybchak@lpnu.ua</w:t>
-      </w:r>
-      <w:r>
-        <w:t xml:space="preserve"> </w:t>
-      </w:r>
-      <w:r>
-        <w:t xml:space="preserve">(Z.R.)</w:t>
-      </w:r>
-      <w:r>
-        <w:br/>
-      </w:r>
-      <m:oMath>
-        <m:sSup>
-          <m:e>
-            <m:r>
-              <m:t>​</m:t>
-            </m:r>
-          </m:e>
-          <m:sup>
-            <m:r>
-              <m:t>2</m:t>
-            </m:r>
-          </m:sup>
-        </m:sSup>
-      </m:oMath>
-      <w:r>
-        <w:t xml:space="preserve"> Institute of Applied Mathematics and Fundamental Sciences,</w:t>
-      </w:r>
-      <w:r>
-        <w:br/>
-      </w:r>
-      <w:r>
-        <w:t xml:space="preserve">Lviv Polytechnic National University, S. Bandery St. 12, 79013 Lviv, Ukraine;</w:t>
-      </w:r>
-      <w:r>
-        <w:br/>
-      </w:r>
-      <w:r>
-        <w:rPr>
-          <w:rStyle w:val="VerbatimChar"/>
-        </w:rPr>
-        <w:t xml:space="preserve">petro.y.pukach@lpnu.ua</w:t>
+      <w:r>
+        <w:t xml:space="preserve">Lviv Polytechnic National University, S. Bandery St. 12, 79013 Lviv, Ukraine</w:t>
       </w:r>
       <w:r>
         <w:br/>
@@ -245,7 +251,7 @@
         <w:rPr>
           <w:rStyle w:val="VerbatimChar"/>
         </w:rPr>
-        <w:t xml:space="preserve">andriy.bilous@uitware.com</w:t>
+        <w:t xml:space="preserve">petro.y.pukach@lpnu.ua</w:t>
       </w:r>
     </w:p>
     <w:p>

</xml_diff>

<commit_message>
Name both GPT-5.5 trap conditions in the artifact list
The last place the exception was still described for W2 alone. Section 7.3 and the paragraph
directly above it already name both conditions, and recompute.py reads both from the audit
summary. The two remaining W2-only mentions nearby are correct as written: they describe the
HTTP 500, which did hit W2 only, not the sourcing perimeter.

No observation, estimate, bound or verdict changes.

Co-Authored-By: Claude Opus 5 <noreply@anthropic.com>
</commit_message>
<xml_diff>
--- a/paper/blackwell-paper-MAKE.docx
+++ b/paper/blackwell-paper-MAKE.docx
@@ -68682,7 +68682,7 @@
         <w:t xml:space="preserve"> </w:t>
       </w:r>
       <w:r>
-        <w:t xml:space="preserve">each read whole except for the GPT-5.5</w:t>
+        <w:t xml:space="preserve">each read whole except for the</w:t>
       </w:r>
       <w:r>
         <w:t xml:space="preserve"> </w:t>
@@ -68696,13 +68696,42 @@
           </m:e>
           <m:sub>
             <m:r>
+              <m:t>1</m:t>
+            </m:r>
+          </m:sub>
+        </m:sSub>
+      </m:oMath>
+      <w:r>
+        <w:t xml:space="preserve"> </w:t>
+      </w:r>
+      <w:r>
+        <w:t xml:space="preserve">and</w:t>
+      </w:r>
+      <w:r>
+        <w:t xml:space="preserve"> </w:t>
+      </w:r>
+      <m:oMath>
+        <m:sSub>
+          <m:e>
+            <m:r>
+              <m:t>W</m:t>
+            </m:r>
+          </m:e>
+          <m:sub>
+            <m:r>
               <m:t>2</m:t>
             </m:r>
           </m:sub>
         </m:sSub>
       </m:oMath>
       <w:r>
-        <w:t xml:space="preserve">/</w:t>
+        <w:t xml:space="preserve"> </w:t>
+      </w:r>
+      <w:r>
+        <w:t xml:space="preserve">conditions of GPT-5.5’s</w:t>
+      </w:r>
+      <w:r>
+        <w:t xml:space="preserve"> </w:t>
       </w:r>
       <w:r>
         <w:rPr>
@@ -68714,7 +68743,7 @@
         <w:t xml:space="preserve"> </w:t>
       </w:r>
       <w:r>
-        <w:t xml:space="preserve">cell described above</w:t>
+        <w:t xml:space="preserve">task described above</w:t>
       </w:r>
       <w:r>
         <w:t xml:space="preserve"> </w:t>

</xml_diff>

<commit_message>
Drop arbitrary bold emphasis; set LaTeX in the body font
Two bolds were mid-sentence emphasis on arbitrary phrases, and both sat in the same sentence as an
\emph, which is the paper's actual emphasis device: "the operative tool is a \textbf{scalar
score}" and "$L_D(W_1,W_2) > 0$ \textbf{verifies} the \emph{population} statement". Removed.

\LaTeX{} sets the logo form, with its raised A and reduced E, which does not match the surrounding
text. Replaced with plain "LaTeX" in the Acknowledgments and in the Methods disclosure, so the two
read alike.

Bold that is structural is left alone: the Keywords label, the (C1)-(C3) contribution markers, the
run-in (i)-(iv) headings used consistently in the controls summary and the scope limits, the proof
case labels, and the emphasised oracle column in Table 5.

Co-Authored-By: Claude Opus 5 <noreply@anthropic.com>
</commit_message>
<xml_diff>
--- a/paper/blackwell-paper-MAKE.docx
+++ b/paper/blackwell-paper-MAKE.docx
@@ -570,20 +570,7 @@
         <w:t xml:space="preserve"> </w:t>
       </w:r>
       <w:r>
-        <w:t xml:space="preserve">operative tool is a</w:t>
-      </w:r>
-      <w:r>
-        <w:t xml:space="preserve"> </w:t>
-      </w:r>
-      <w:r>
-        <w:rPr>
-          <w:b/>
-          <w:bCs/>
-        </w:rPr>
-        <w:t xml:space="preserve">scalar score</w:t>
-      </w:r>
-      <w:r>
-        <w:t xml:space="preserve">, lexical or embedding relevance,</w:t>
+        <w:t xml:space="preserve">operative tool is a scalar score, lexical or embedding relevance,</w:t>
       </w:r>
       <w:r>
         <w:t xml:space="preserve"> </w:t>
@@ -25120,26 +25107,10 @@
       </w:r>
       <w:r>
         <w:rPr>
-          <w:b/>
-          <w:bCs/>
-          <w:i/>
-          <w:iCs/>
-        </w:rPr>
-        <w:t xml:space="preserve">verifies</w:t>
-      </w:r>
-      <w:r>
-        <w:rPr>
-          <w:i/>
-          <w:iCs/>
-        </w:rPr>
-        <w:t xml:space="preserve"> </w:t>
-      </w:r>
-      <w:r>
-        <w:rPr>
-          <w:i/>
-          <w:iCs/>
-        </w:rPr>
-        <w:t xml:space="preserve">the</w:t>
+          <w:i/>
+          <w:iCs/>
+        </w:rPr>
+        <w:t xml:space="preserve">verifies the</w:t>
       </w:r>
       <w:r>
         <w:rPr>

</xml_diff>